<commit_message>
Employee Attrition report: second-round review fixes (H4 partial, precision wording, causal language, limitations, replacement-cost parameter)
Co-Authored-By: Claude Opus 5.5 <noreply@anthropic.com>
Claude-Session: https://claude.ai/code/session_01X5xVffgcgtEXBxQQecpyTH
</commit_message>
<xml_diff>
--- a/Employee Attrition (sửa theo CMT)/Báo cáo - Quỳnh (đã sửa theo CMT).docx
+++ b/Employee Attrition (sửa theo CMT)/Báo cáo - Quỳnh (đã sửa theo CMT).docx
@@ -1146,7 +1146,7 @@
             </w:rPr>
             <w:t xml:space="preserve">1.3. Cơ sở lý thuyết</w:t>
             <w:tab/>
-            <w:t xml:space="preserve">5</w:t>
+            <w:t xml:space="preserve">6</w:t>
           </w:r>
         </w:p>
         <w:p>
@@ -1476,7 +1476,7 @@
             <w:rPr>
               <w:rtl w:val="0"/>
             </w:rPr>
-            <w:t xml:space="preserve">5.1. Tổng quan: vấn đề nằm ở tuyến đầu</w:t>
+            <w:t xml:space="preserve">5.1. Tổng quan: nghỉ việc tập trung ở các vị trí cấp thấp</w:t>
             <w:tab/>
             <w:t xml:space="preserve">14</w:t>
           </w:r>
@@ -1860,7 +1860,7 @@
             </w:rPr>
             <w:t xml:space="preserve">8.3. Hướng phát triển</w:t>
             <w:tab/>
-            <w:t xml:space="preserve">25</w:t>
+            <w:t xml:space="preserve">26</w:t>
           </w:r>
         </w:p>
         <w:p>
@@ -1881,7 +1881,7 @@
             </w:rPr>
             <w:t xml:space="preserve">9. Tài liệu tham khảo</w:t>
             <w:tab/>
-            <w:t xml:space="preserve">26</w:t>
+            <w:t xml:space="preserve">27</w:t>
           </w:r>
           <w:r>
             <w:rPr>
@@ -2103,7 +2103,7 @@
         </w:rPr>
         <w:t xml:space="preserve">Bảng 5.3. Tỷ lệ nghỉ việc theo mức của năm thang hài lòng - gắn kết</w:t>
         <w:tab/>
-        <w:t xml:space="preserve">16</w:t>
+        <w:t xml:space="preserve">17</w:t>
       </w:r>
     </w:p>
     <w:p>
@@ -3073,7 +3073,7 @@
         <w:rPr>
           <w:rtl w:val="0"/>
         </w:rPr>
-        <w:t xml:space="preserve">Nghỉ việc tự nguyện tốn kém hơn nhiều so với con số trên bảng lương. Chi phí thay thế một nhân viên thường bằng khoảng 16-21% lương năm với vị trí lương trung bình và cao hơn nhiều với vị trí chuyên môn (Boushey và Glynn, 2012). Vì vậy báo cáo dùng </w:t>
+        <w:t xml:space="preserve">Nghỉ việc tốn kém hơn nhiều so với con số trên bảng lương (dữ liệu không phân biệt nghỉ tự nguyện hay không tự nguyện, nên báo cáo dùng chung khái niệm “nghỉ việc”). Chi phí thay thế một nhân viên thường bằng khoảng 16-21% lương năm với vị trí lương trung bình và cao hơn nhiều với vị trí chuyên môn (Boushey và Glynn, 2012). Vì vậy báo cáo dùng </w:t>
       </w:r>
       <w:r>
         <w:rPr>
@@ -3087,7 +3087,7 @@
         <w:rPr>
           <w:rtl w:val="0"/>
         </w:rPr>
-        <w:t xml:space="preserve"> và 50% làm kịch bản cao cho các vị trí chuyên môn; dashboard cho phép chọn từ 25% đến 150%. Ngoài chi phí tuyển dụng - đào tạo, công ty còn mất kiến thức, năng suất của đội nhóm và mối quan hệ khách hàng, nhất là ở khối Sales.</w:t>
+        <w:t xml:space="preserve"> và 50% làm kịch bản cao cho các vị trí chuyên môn; tham số chi phí thay thế trên dashboard cho phép chọn từ 10% đến 150% và mặc định là 20%. Ngoài chi phí tuyển dụng - đào tạo, công ty còn mất kiến thức, năng suất của đội nhóm và mối quan hệ khách hàng, nhất là ở khối Sales.</w:t>
       </w:r>
     </w:p>
     <w:p>
@@ -3339,7 +3339,7 @@
           <w:bCs w:val="1"/>
           <w:rtl w:val="0"/>
         </w:rPr>
-        <w:t xml:space="preserve">Thuyết hai nhân tố của Herzberg (1959):</w:t>
+        <w:t xml:space="preserve">Thuyết hai nhân tố của Herzberg và cộng sự (1959):</w:t>
       </w:r>
       <w:r>
         <w:rPr>
@@ -3488,7 +3488,7 @@
           <w:szCs w:val="22"/>
           <w:rtl w:val="0"/>
         </w:rPr>
-        <w:t xml:space="preserve">Nguồn: Nhóm tác giả đề xuất dựa trên Mobley (1977), Herzberg (1959) và Mitchell và cộng sự (2001).</w:t>
+        <w:t xml:space="preserve">Nguồn: Nhóm tác giả đề xuất dựa trên Mobley (1977), Herzberg và cộng sự (1959) và Mitchell và cộng sự (2001).</w:t>
       </w:r>
       <w:r>
         <w:rPr>
@@ -6297,7 +6297,7 @@
         <w:rPr>
           <w:rtl w:val="0"/>
         </w:rPr>
-        <w:t xml:space="preserve">Dữ liệu gốc sạch về mặt kỹ thuật (không thiếu, không trùng), nên công việc chính là loại cột vô ích, chuẩn hóa nhãn, tạo 42 cột dẫn xuất và dựng mô hình dữ liệu dạng sao. Bảng Employees sau xử lý có 1.470 dòng và 71 cột.</w:t>
+        <w:t xml:space="preserve">Dữ liệu gốc sạch về mặt kỹ thuật (không thiếu, không trùng), nên công việc chính là loại các cột không mang thông tin hoặc không dùng được, chuẩn hóa nhãn, tạo 42 cột dẫn xuất và dựng mô hình dữ liệu dạng sao. Bảng Employees sau xử lý có 1.470 dòng và 71 cột.</w:t>
       </w:r>
     </w:p>
     <w:p>
@@ -6827,64 +6827,49 @@
                 <w:szCs w:val="22"/>
                 <w:rtl w:val="0"/>
               </w:rPr>
-              <w:t xml:space="preserve">Mâu thuẫn logic</w:t>
-            </w:r>
-            <w:r>
-              <w:rPr>
-                <w:rtl w:val="0"/>
-              </w:rPr>
-            </w:r>
-          </w:p>
-        </w:tc>
-        <w:tc>
-          <w:tcPr>
-            <w:vAlign w:val="center"/>
-          </w:tcPr>
-          <w:p>
-            <w:pPr>
-              <w:spacing w:line="240" w:lineRule="auto"/>
-              <w:ind w:firstLine="0"/>
-              <w:jc w:val="left"/>
-              <w:rPr/>
-            </w:pPr>
-            <w:r>
-              <w:rPr>
-                <w:sz w:val="22"/>
-                <w:szCs w:val="22"/>
-                <w:rtl w:val="0"/>
-              </w:rPr>
-              <w:t xml:space="preserve">197 người có NumCompaniesWorked = 0 nhưng TotalWorkingYears &gt; YearsAtCompany</w:t>
-            </w:r>
-            <w:r>
-              <w:rPr>
-                <w:rtl w:val="0"/>
-              </w:rPr>
-            </w:r>
-          </w:p>
-        </w:tc>
-        <w:tc>
-          <w:tcPr>
-            <w:vAlign w:val="center"/>
-          </w:tcPr>
-          <w:p>
-            <w:pPr>
-              <w:spacing w:line="240" w:lineRule="auto"/>
-              <w:ind w:firstLine="0"/>
-              <w:jc w:val="left"/>
-              <w:rPr/>
-            </w:pPr>
-            <w:r>
-              <w:rPr>
-                <w:sz w:val="22"/>
-                <w:szCs w:val="22"/>
-                <w:rtl w:val="0"/>
-              </w:rPr>
-              <w:t xml:space="preserve">Gắn cờ Flag_NumCompanies_Inconsistent, không xóa để giữ đủ mẫu</w:t>
-            </w:r>
-            <w:r>
-              <w:rPr>
-                <w:rtl w:val="0"/>
-              </w:rPr>
+              <w:t xml:space="preserve">Không nhất quán khi mã hóa</w:t>
+            </w:r>
+          </w:p>
+        </w:tc>
+        <w:tc>
+          <w:tcPr>
+            <w:vAlign w:val="center"/>
+          </w:tcPr>
+          <w:p>
+            <w:pPr>
+              <w:spacing w:line="240" w:lineRule="auto"/>
+              <w:ind w:firstLine="0"/>
+              <w:jc w:val="left"/>
+              <w:rPr/>
+            </w:pPr>
+            <w:r>
+              <w:rPr>
+                <w:sz w:val="22"/>
+                <w:szCs w:val="22"/>
+                <w:rtl w:val="0"/>
+              </w:rPr>
+              <w:t xml:space="preserve">197 người có NumCompaniesWorked = 0 nhưng TotalWorkingYears lớn hơn YearsAtCompany; ở cả 197 người, chênh lệch đều đúng 1 năm</w:t>
+            </w:r>
+          </w:p>
+        </w:tc>
+        <w:tc>
+          <w:tcPr>
+            <w:vAlign w:val="center"/>
+          </w:tcPr>
+          <w:p>
+            <w:pPr>
+              <w:spacing w:line="240" w:lineRule="auto"/>
+              <w:ind w:firstLine="0"/>
+              <w:jc w:val="left"/>
+              <w:rPr/>
+            </w:pPr>
+            <w:r>
+              <w:rPr>
+                <w:sz w:val="22"/>
+                <w:szCs w:val="22"/>
+                <w:rtl w:val="0"/>
+              </w:rPr>
+              <w:t xml:space="preserve">Gắn cờ Flag_NumCompanies_Inconsistent, không xóa: chênh lệch đồng nhất gợi ý do cách mã hóa (0 có thể nghĩa là đã làm 1 công ty trước đó) hơn là lỗi nhập liệu</w:t>
             </w:r>
           </w:p>
         </w:tc>
@@ -7477,25 +7462,7 @@
                 <w:szCs w:val="22"/>
                 <w:rtl w:val="0"/>
               </w:rPr>
-              <w:t xml:space="preserve">YearsAtCompany: 0-1, 2-5, 6-10, 11-20, 20+ năm; </w:t>
-            </w:r>
-            <w:r>
-              <w:rPr>
-                <w:b w:val="1"/>
-                <w:bCs w:val="1"/>
-                <w:sz w:val="22"/>
-                <w:szCs w:val="22"/>
-                <w:rtl w:val="0"/>
-              </w:rPr>
-              <w:t xml:space="preserve">mới vào = 0-1 năm</w:t>
-            </w:r>
-            <w:r>
-              <w:rPr>
-                <w:sz w:val="22"/>
-                <w:szCs w:val="22"/>
-                <w:rtl w:val="0"/>
-              </w:rPr>
-              <w:t xml:space="preserve"> (YearsAtCompany = 0 hoặc 1, tức dưới 2 năm thâm niên)</w:t>
+              <w:t xml:space="preserve">YearsAtCompany: 0-1, 2-5, 6-10, 11-20, 21+ năm; mới vào = 0-1 năm (YearsAtCompany = 0 hoặc 1, tức dưới 2 năm thâm niên)</w:t>
             </w:r>
           </w:p>
         </w:tc>
@@ -8162,7 +8129,7 @@
         <w:rPr>
           <w:rtl w:val="0"/>
         </w:rPr>
-        <w:t xml:space="preserve">Mô hình gồm 9 bảng, theo dạng sao với Employees là bảng sự kiện. Bốn bảng chiều (Dim_Department, Dim_AgeGroup, Dim_IncomeBand, Dim_Tenure) được tạo bằng Power Query M (#table) để cố định thứ tự nhóm trên trục. Bảng Satisfaction_Long được tạo bằng thao tác </w:t>
+        <w:t xml:space="preserve">Mô hình gồm 9 bảng, tổ chức theo dạng sao với Employees là bảng trung tâm (mỗi dòng một nhân viên). Bốn bảng chiều (Dim_Department, Dim_AgeGroup, Dim_IncomeBand, Dim_Tenure) được tạo bằng Power Query M (#table) để cố định thứ tự nhóm trên trục. Bảng Satisfaction_Long được tạo bằng thao tác </w:t>
       </w:r>
       <w:r>
         <w:rPr>
@@ -8176,7 +8143,7 @@
         <w:rPr>
           <w:rtl w:val="0"/>
         </w:rPr>
-        <w:t xml:space="preserve"> 5 thang đo hài lòng/gắn kết, cho phép vẽ 5 thang trên cùng một biểu đồ. Driver_Impact là bảng tổng hợp hệ số rủi ro của 16 yếu tố; Replacement Cost là bảng tham số GENERATESERIES(0.25, 1.5, 0.25) để người xem tự chọn tỷ lệ chi phí thay thế; _Measures chứa toàn bộ measure.</w:t>
+        <w:t xml:space="preserve"> 5 thang đo hài lòng/gắn kết, cho phép vẽ 5 thang trên cùng một biểu đồ. Driver_Impact là bảng tổng hợp hệ số rủi ro của 16 yếu tố; Replacement Cost là bảng tham số GENERATESERIES(0.1, 1.5, 0.05) để người xem tự chọn tỷ lệ chi phí thay thế (khi chưa chọn, measure dùng mức 20%); _Measures chứa toàn bộ measure.</w:t>
       </w:r>
     </w:p>
     <w:p>
@@ -8970,7 +8937,7 @@
                 <w:szCs w:val="22"/>
                 <w:rtl w:val="0"/>
               </w:rPr>
-              <w:t xml:space="preserve">Mặc định trên dashboard 50% lương năm (kịch bản cao), điều chỉnh 25-150%; báo cáo dùng 20% làm mức cơ sở</w:t>
+              <w:t xml:space="preserve">Mặc định 20% lương năm (mức cơ sở của báo cáo), điều chỉnh 10-150%; 50% là kịch bản cao</w:t>
             </w:r>
           </w:p>
         </w:tc>
@@ -9869,12 +9836,7 @@
                 <w:szCs w:val="22"/>
                 <w:rtl w:val="0"/>
               </w:rPr>
-              <w:t xml:space="preserve">Cứ 6 nhân viên có 1 người rời đi - từ tuyến đầu</w:t>
-            </w:r>
-            <w:r>
-              <w:rPr>
-                <w:rtl w:val="0"/>
-              </w:rPr>
+              <w:t xml:space="preserve">Cứ 6 nhân viên có 1 người rời đi - tập trung ở các vị trí cấp thấp</w:t>
             </w:r>
           </w:p>
         </w:tc>
@@ -10089,12 +10051,7 @@
                 <w:szCs w:val="22"/>
                 <w:rtl w:val="0"/>
               </w:rPr>
-              <w:t xml:space="preserve">Làm thêm giờ là yếu tố nguy hiểm nhất</w:t>
-            </w:r>
-            <w:r>
-              <w:rPr>
-                <w:rtl w:val="0"/>
-              </w:rPr>
+              <w:t xml:space="preserve">Làm thêm giờ gắn với chênh lệch tỷ lệ nghỉ lớn nhất</w:t>
             </w:r>
           </w:p>
         </w:tc>
@@ -10304,12 +10261,7 @@
                 <w:szCs w:val="22"/>
                 <w:rtl w:val="0"/>
               </w:rPr>
-              <w:t xml:space="preserve">Đổi quản lý làm tỷ lệ nghỉ tăng gần gấp đôi</w:t>
-            </w:r>
-            <w:r>
-              <w:rPr>
-                <w:rtl w:val="0"/>
-              </w:rPr>
+              <w:t xml:space="preserve">Vừa đổi quản lý: tỷ lệ nghỉ 23,0% so với 12,4%</w:t>
             </w:r>
           </w:p>
         </w:tc>
@@ -10468,7 +10420,7 @@
         <w:rPr>
           <w:rtl w:val="0"/>
         </w:rPr>
-        <w:t xml:space="preserve">Nghỉ việc không phân bố đều: nó dồn vào nhóm tuyến đầu, cấp thấp, mới vào và phải làm thêm giờ. Phần này đi theo thứ tự 6 trang dashboard; mọi con số là số toàn công ty.</w:t>
+        <w:t xml:space="preserve">Nghỉ việc không phân bố đều: nó tập trung ở nhân viên cấp thấp, mới vào và phải làm thêm giờ. Phần này đi theo thứ tự 6 trang dashboard; mọi con số là số toàn công ty.</w:t>
       </w:r>
     </w:p>
     <w:p>
@@ -10482,7 +10434,7 @@
         <w:rPr>
           <w:rtl w:val="0"/>
         </w:rPr>
-        <w:t xml:space="preserve">5.1. Tổng quan: vấn đề nằm ở tuyến đầu</w:t>
+        <w:t xml:space="preserve">5.1. Tổng quan: nghỉ việc tập trung ở các vị trí cấp thấp</w:t>
       </w:r>
     </w:p>
     <w:p>
@@ -10623,7 +10575,7 @@
         <w:rPr>
           <w:rtl w:val="0"/>
         </w:rPr>
-        <w:t xml:space="preserve">Ba vị trí tuyến đầu (Sales Representative, Laboratory Technician, Human Resources) nằm trên mức chung, trong khi Manager và Research Director chỉ 2,5-4,9%.</w:t>
+        <w:t xml:space="preserve">Bốn vị trí có tỷ lệ nghỉ cao hơn mức chung 16,1% là Sales Representative (39,8%), Laboratory Technician (23,9%), Human Resources (23,1%) và Sales Executive (17,5%); Research Scientist ngang mức chung (16,1%). Ở ba vị trí cao nhất, phần lớn nhân viên thuộc Level 1 (64-92%), trong khi hai vị trí cấp cao là Manager và Research Director chỉ có tỷ lệ nghỉ 4,9% và 2,5%. Trong báo cáo, “vị trí cấp thấp” chỉ các vị trí có đa số nhân viên ở Level 1.</w:t>
       </w:r>
     </w:p>
     <w:p>
@@ -11717,7 +11669,7 @@
         <w:rPr>
           <w:rtl w:val="0"/>
         </w:rPr>
-        <w:t xml:space="preserve">Lứa tuổi 18-25 nghỉ gấp 4 lần nhóm 36-45, và giai đoạn mới vào (0-1 năm) là giai đoạn nguy hiểm nhất. 60% người nghỉ là Level 1 và 42% từ 30 tuổi trở xuống. Khác biệt theo học vấn (18,2% so với 10,4%) không có ý nghĩa thống kê (p = 0,55; nhóm Tiến sĩ chỉ có 48 người). Khác biệt theo giới tính khi xét riêng cũng không có ý nghĩa (17,0% so với 14,8%; p = 0,29), nhưng khi kiểm soát các yếu tố khác, nam có odds nghỉ việc cao hơn nữ (OR = 1,53; p = 0,02 - xem mục 6.2). Công ty không đổi được tuổi hay tình trạng hôn nhân, nhưng biết chính xác nhóm nào cần ưu tiên giữ chân.</w:t>
+        <w:t xml:space="preserve">Lứa tuổi 18-25 nghỉ gấp 4 lần nhóm 36-45, và giai đoạn mới vào (0-1 năm) là giai đoạn có tỷ lệ nghỉ cao nhất. 60% người nghỉ là Level 1 và 42% từ 30 tuổi trở xuống. Khác biệt theo học vấn (18,2% so với 10,4%) không có ý nghĩa thống kê (p = 0,55; nhóm Tiến sĩ chỉ có 48 người). Khác biệt theo giới tính khi xét riêng cũng không có ý nghĩa (17,0% so với 14,8%; p = 0,29), nhưng khi kiểm soát các yếu tố khác, nam có odds nghỉ việc cao hơn nữ (OR = 1,53; p = 0,02 - xem mục 6.2). Công ty không đổi được tuổi hay tình trạng hôn nhân, nhưng biết chính xác nhóm nào cần ưu tiên giữ chân.</w:t>
       </w:r>
     </w:p>
     <w:p>
@@ -11860,7 +11812,7 @@
         <w:rPr>
           <w:rtl w:val="0"/>
         </w:rPr>
-        <w:t xml:space="preserve">Làm thêm giờ tăng tỷ lệ nghỉ ở cả 5 cấp, nên đây là hiệu ứng riêng chứ không chỉ là bóng của cấp bậc. Level 4-5 có ít người nên tỷ lệ ở hai nhóm này dao động lớn.</w:t>
+        <w:t xml:space="preserve">Ở cả 5 cấp, người làm thêm giờ đều có tỷ lệ nghỉ cao hơn, nên khác biệt này không chỉ là bóng của cấp bậc. Level 4-5 có ít người nên tỷ lệ ở hai nhóm này dao động lớn.</w:t>
       </w:r>
     </w:p>
     <w:p>
@@ -12147,38 +12099,28 @@
                 <w:szCs w:val="22"/>
                 <w:rtl w:val="0"/>
               </w:rPr>
-              <w:t xml:space="preserve">Cân bằng CV-CS</w:t>
-            </w:r>
-            <w:r>
-              <w:rPr>
-                <w:rtl w:val="0"/>
-              </w:rPr>
-            </w:r>
-          </w:p>
-        </w:tc>
-        <w:tc>
-          <w:tcPr>
-            <w:vAlign w:val="center"/>
-          </w:tcPr>
-          <w:p>
-            <w:pPr>
-              <w:spacing w:line="240" w:lineRule="auto"/>
-              <w:ind w:firstLine="0"/>
-              <w:jc w:val="left"/>
-              <w:rPr/>
-            </w:pPr>
-            <w:r>
-              <w:rPr>
-                <w:sz w:val="22"/>
-                <w:szCs w:val="22"/>
-                <w:rtl w:val="0"/>
-              </w:rPr>
-              <w:t xml:space="preserve">Bad (n = 80) / Good / Better / Best</w:t>
-            </w:r>
-            <w:r>
-              <w:rPr>
-                <w:rtl w:val="0"/>
-              </w:rPr>
+              <w:t xml:space="preserve">Cân bằng CV-CS (thang 1-4)</w:t>
+            </w:r>
+          </w:p>
+        </w:tc>
+        <w:tc>
+          <w:tcPr>
+            <w:vAlign w:val="center"/>
+          </w:tcPr>
+          <w:p>
+            <w:pPr>
+              <w:spacing w:line="240" w:lineRule="auto"/>
+              <w:ind w:firstLine="0"/>
+              <w:jc w:val="left"/>
+              <w:rPr/>
+            </w:pPr>
+            <w:r>
+              <w:rPr>
+                <w:sz w:val="22"/>
+                <w:szCs w:val="22"/>
+                <w:rtl w:val="0"/>
+              </w:rPr>
+              <w:t xml:space="preserve">Mức 1 (n = 80) / Mức 2 (n = 344) / Mức 3 (n = 893) / Mức 4 (n = 153)</w:t>
             </w:r>
           </w:p>
         </w:tc>
@@ -12330,6 +12272,18 @@
           <w:rtl w:val="0"/>
         </w:rPr>
         <w:t xml:space="preserve">5.4. Lương và đãi ngộ: cổ phiếu và cấp bậc nổi bật hơn mức lương</w:t>
+      </w:r>
+    </w:p>
+    <w:p>
+      <w:pPr>
+        <w:spacing w:after="240" w:line="240" w:lineRule="auto"/>
+        <w:rPr/>
+      </w:pPr>
+      <w:r>
+        <w:rPr>
+          <w:rtl w:val="0"/>
+        </w:rPr>
+        <w:t xml:space="preserve">Phần này so sánh mức lương với hai yếu tố đi kèm là cấp bậc và quyền chọn cổ phiếu. Cấp bậc đã được trình bày ở mục 5.2 (Level 1 nghỉ 26,3%) và vẫn có ý nghĩa trong mô hình đa biến (Level 1 OR = 3,63, mục 6.2); phần lớn khác biệt theo thu nhập trùng với khác biệt theo cấp bậc:</w:t>
       </w:r>
     </w:p>
     <w:p>
@@ -14133,7 +14087,7 @@
         <w:rPr>
           <w:rtl w:val="0"/>
         </w:rPr>
-        <w:t xml:space="preserve">Sau khi kiểm soát đồng thời 22 biến, làm thêm giờ vẫn là yếu tố mạnh nhất: nó nhân odds nghỉ việc lên 6,6 lần. Sáu giả thuyết được chấp nhận (H1, H2, H4, H5, H6, H7), hai giả thuyết được chấp nhận một phần (H3, H8) và không giả thuyết nào bị bác bỏ hoàn toàn. Phân tích thực hiện bằng Python (pandas, SciPy, statsmodels, scikit-learn) trên cùng bảng Employees đã nạp vào Power BI, mức ý nghĩa α = 0,05.</w:t>
+        <w:t xml:space="preserve">Sau khi kiểm soát đồng thời 22 biến, làm thêm giờ vẫn là biến có liên hệ mạnh nhất: odds nghỉ việc của người làm thêm giờ cao gấp 6,6 lần. Năm giả thuyết được chấp nhận (H1, H2, H5, H6, H7), ba giả thuyết được chấp nhận một phần (H3, H4, H8) và không giả thuyết nào bị bác bỏ hoàn toàn. Phân tích thực hiện bằng Python (pandas, SciPy, statsmodels, scikit-learn) trên cùng bảng Employees đã nạp vào Power BI, mức ý nghĩa α = 0,05.</w:t>
       </w:r>
     </w:p>
     <w:p>
@@ -14497,7 +14451,7 @@
         <w:rPr>
           <w:rtl w:val="0"/>
         </w:rPr>
-        <w:t xml:space="preserve"> là tỷ số odds khi giữ nguyên các biến khác: OR &gt; 1 nghĩa là odds nghỉ việc cao hơn, OR &lt; 1 là thấp hơn. OR không phải tỷ số xác suất: OR = 6,56 của làm thêm giờ nghĩa là odds nghỉ việc cao gấp 6,56 lần, không phải xác suất nghỉ cao gấp 6,56 lần. Mô hình gồm 22 biến: OverTime, Age, NewHire (0-1 năm), log(MonthlyIncome), Level 1, không có cổ phiếu, độc thân, công tác thường xuyên, 5 thang hài lòng/gắn kết, vừa đổi quản lý, số năm từ lần thăng chức cuối, số lần đào tạo, khoảng cách, số công ty đã làm, giới tính, học vấn, điểm hiệu suất và phòng ban. Thâm niên được đưa vào dưới dạng biến NewHire thay vì YearsAtCompany vì rủi ro dồn vào 2 năm đầu (0-1 năm nghỉ 34,9%, các nhóm từ 2 năm trở lên chỉ 6,7-15,5%), quan hệ không tuyến tính, và YearsAtCompany tương quan mạnh với YearsWithCurrManager, YearsSinceLastPromotion đã có trong mô hình. Thu nhập được lấy log để giảm độ lệch; VIF lớn nhất là 5,9 (&lt; 10), không có đa cộng tuyến nghiêm trọng.</w:t>
+        <w:t xml:space="preserve"> là tỷ số odds khi giữ nguyên các biến khác: OR &gt; 1 nghĩa là odds nghỉ việc cao hơn, OR &lt; 1 là thấp hơn. OR không phải tỷ số xác suất: OR = 6,56 của làm thêm giờ nghĩa là odds nghỉ việc cao gấp 6,56 lần, không phải xác suất nghỉ cao gấp 6,56 lần. Mô hình gồm 22 biến: OverTime, Age, NewHire (0-1 năm), log(MonthlyIncome), Level 1, không có cổ phiếu, độc thân, công tác thường xuyên, 5 thang hài lòng/gắn kết, vừa đổi quản lý, số năm từ lần thăng chức cuối, số lần đào tạo, khoảng cách, số công ty đã làm, giới tính, học vấn, điểm hiệu suất và phòng ban. Thâm niên được đưa vào dưới dạng biến NewHire thay vì YearsAtCompany vì rủi ro dồn vào 2 năm đầu (0-1 năm nghỉ 34,9%, các nhóm từ 2 năm trở lên chỉ 6,7-15,5%), quan hệ không tuyến tính, và YearsAtCompany tương quan mạnh với YearsWithCurrManager và YearsSinceLastPromotion (hai biến đã có trong mô hình, YearsWithCurrManager qua biến vừa đổi quản lý). Thu nhập được lấy log để giảm độ lệch; VIF lớn nhất là 5,9 (&lt; 10), không có đa cộng tuyến nghiêm trọng.</w:t>
       </w:r>
     </w:p>
     <w:p>
@@ -15125,7 +15079,7 @@
                 <w:szCs w:val="22"/>
                 <w:rtl w:val="0"/>
               </w:rPr>
-              <w:t xml:space="preserve">Chấp nhận cho nhân viên đã kết hôn/ly hôn; chưa kiểm chứng được với nhân viên độc thân (100% ở mức 0)</w:t>
+              <w:t xml:space="preserve">Chấp nhận một phần: đúng với nhân viên đã kết hôn/ly hôn; chưa kiểm chứng được với nhân viên độc thân (100% ở mức 0)</w:t>
             </w:r>
           </w:p>
         </w:tc>
@@ -15599,7 +15553,7 @@
         <w:rPr>
           <w:rtl w:val="0"/>
         </w:rPr>
-        <w:t xml:space="preserve">Ba kết quả đáng chú ý. Thứ nhất, sau khi kiểm soát các yếu tố khác, tình trạng độc thân không còn có ý nghĩa thống kê (OR = 1,38; p = 0,25), trong khi biến không có quyền chọn cổ phiếu vẫn có ý nghĩa (OR = 2,71; p &lt; 0,001). Vì 100% nhân viên độc thân không có cổ phiếu, kết quả chỉ gợi ý cần nghiên cứu thêm mối liên hệ giữa hôn nhân, cổ phiếu và nghỉ việc; chưa đủ cơ sở để kết luận quan hệ nhân quả. Thứ hai, giới tính không có ý nghĩa khi xét riêng (p = 0,29) nhưng có ý nghĩa trong mô hình (nam OR = 1,53; p = 0,02). Hai kiểm định đo hai điều khác nhau: nữ làm thêm giờ nhiều hơn nam (30,6% so với 26,8%), nên khi so sánh nam và nữ có cùng điều kiện làm thêm giờ và các yếu tố khác, khoảng cách mới lộ rõ. Vì vậy không thể kết luận giới tính không có tác động. Thứ ba, ba biến ít được chú ý cũng có ý nghĩa: mỗi công ty từng làm tăng odds 21%, mỗi dặm khoảng cách tăng 4,5%, và mỗi lần đào tạo giảm 16%.</w:t>
+        <w:t xml:space="preserve">Ba kết quả đáng chú ý. Thứ nhất, sau khi kiểm soát các yếu tố khác, tình trạng độc thân không còn có ý nghĩa thống kê (OR = 1,38; p = 0,25), trong khi biến không có quyền chọn cổ phiếu vẫn có ý nghĩa (OR = 2,71; p &lt; 0,001). Vì 100% nhân viên độc thân không có cổ phiếu, kết quả chỉ gợi ý cần nghiên cứu thêm mối liên hệ giữa hôn nhân, cổ phiếu và nghỉ việc; chưa đủ cơ sở để kết luận quan hệ nhân quả. Thứ hai, giới tính không có ý nghĩa khi xét riêng (p = 0,29) nhưng có ý nghĩa trong mô hình (nam OR = 1,53; p = 0,02). Hai kiểm định đo hai điều khác nhau: nữ làm thêm giờ nhiều hơn nam (30,6% so với 26,8%), nên khi so sánh nam và nữ có cùng điều kiện làm thêm giờ và các yếu tố khác, khoảng cách mới lộ rõ. Vì vậy không thể kết luận giới tính không có tác động. Thứ ba, ba biến ít được chú ý cũng có ý nghĩa: mỗi công ty từng làm gắn với odds nghỉ cao hơn 21%, mỗi dặm khoảng cách cao hơn 4,5%, và mỗi lần đào tạo thấp hơn 16%.</w:t>
       </w:r>
     </w:p>
     <w:p>
@@ -15716,7 +15670,7 @@
         <w:rPr>
           <w:rtl w:val="0"/>
         </w:rPr>
-        <w:t xml:space="preserve">Các biến bên phải đường OR = 1 làm tăng khả năng nghỉ; các thang hài lòng, gắn kết, tuổi và đào tạo nằm bên trái, tức có tác dụng giữ chân. Với biến liên tục, OR tính cho mỗi đơn vị tăng thêm.</w:t>
+        <w:t xml:space="preserve">Các biến bên phải đường OR = 1 gắn với odds nghỉ cao hơn; các thang hài lòng, gắn kết, tuổi và đào tạo nằm bên trái, tức gắn với odds nghỉ thấp hơn. Với biến liên tục, OR tính cho mỗi đơn vị tăng thêm.</w:t>
       </w:r>
     </w:p>
     <w:p>
@@ -16364,7 +16318,7 @@
         <w:rPr>
           <w:rtl w:val="0"/>
         </w:rPr>
-        <w:t xml:space="preserve">AUC kiểm định chéo 5 lần là 0,856 ± 0,016, cho thấy mô hình ổn định. Mô hình “nghỉ = không ai” đã đạt 83,9% accuracy, nên accuracy không phải thước đo phù hợp với dữ liệu mất cân bằng. Hạ ngưỡng từ 0,5 xuống 0,3 tăng recall từ 46,5% lên 71,8% trong khi precision vẫn ở mức 63,8%, nên ngưỡng 0,3 được dùng để đánh giá mô hình. Kiểm định Hosmer-Lemeshow có giả thuyết không là xác suất dự báo phù hợp với tần suất thực tế; kết quả χ²(8) = 75,7, p &lt; 0,001 cho bằng chứng bác bỏ giả thuyết này, tức mô hình có dấu hiệu hiệu chỉnh (calibration) chưa tốt: dự báo thấp hơn thực tế ở nhóm rủi ro thấp nhất và cao nhất, cao hơn thực tế ở các nhóm giữa. Vì vậy mô hình nên dùng để </w:t>
+        <w:t xml:space="preserve">AUC kiểm định chéo 5 lần là 0,856 ± 0,016, cho thấy mô hình ổn định. Mô hình “nghỉ = không ai” đã đạt 83,9% accuracy, nên accuracy không phải thước đo phù hợp với dữ liệu mất cân bằng. Hạ ngưỡng từ 0,5 xuống 0,3 tăng recall từ 46,5% lên 71,8%, đổi lại precision giảm từ 80,5% xuống 63,8% và cảnh báo nhầm tăng từ 8 lên 29. Hai ngưỡng này chỉ minh họa sự đánh đổi giữa bắt đủ và cảnh báo nhầm; hệ thống cảnh báo ở mục 7.2 dùng cách xếp hạng và chọn 10% nhân viên có điểm cao nhất. Kiểm định Hosmer-Lemeshow có giả thuyết không là xác suất dự báo phù hợp với tần suất thực tế; kết quả χ²(8) = 75,7, p &lt; 0,001 cho bằng chứng bác bỏ giả thuyết này, tức mô hình có dấu hiệu hiệu chỉnh (calibration) chưa tốt: dự báo thấp hơn thực tế ở nhóm rủi ro thấp nhất và cao nhất, cao hơn thực tế ở các nhóm giữa. Vì vậy mô hình nên dùng để </w:t>
       </w:r>
       <w:r>
         <w:rPr>
@@ -16404,7 +16358,7 @@
         <w:rPr>
           <w:rtl w:val="0"/>
         </w:rPr>
-        <w:t xml:space="preserve">Hồi quy logistic chính xác nhưng khó diễn giải cho quản lý tuyến. Nhóm dựng thêm một cây quyết định 3 tầng (mỗi lá ≥ 30 nhân viên) để rút ra quy tắc “nếu - thì”. Cây có AUC 0,766 trên tập kiểm tra, thấp hơn logistic, nhưng tự động chọn làm thêm giờ làm nhánh đầu tiên - khớp với kết quả trên.</w:t>
+        <w:t xml:space="preserve">Hồi quy logistic chính xác nhưng khó diễn giải cho quản lý trực tiếp. Nhóm dựng thêm một cây quyết định 3 tầng (mỗi lá ≥ 30 nhân viên) để rút ra quy tắc “nếu - thì”. Cây có AUC 0,766 trên tập kiểm tra, thấp hơn logistic, nhưng tự động chọn làm thêm giờ làm nhánh đầu tiên - khớp với kết quả trên.</w:t>
       </w:r>
     </w:p>
     <w:p>
@@ -16928,28 +16882,28 @@
                 <w:szCs w:val="22"/>
                 <w:rtl w:val="0"/>
               </w:rPr>
-              <w:t xml:space="preserve">Level 1 làm thêm giờ (156 người) và NV mới vào 0-1 năm làm thêm giờ (69 người)</w:t>
-            </w:r>
-          </w:p>
-        </w:tc>
-        <w:tc>
-          <w:tcPr>
-            <w:vAlign w:val="center"/>
-          </w:tcPr>
-          <w:p>
-            <w:pPr>
-              <w:spacing w:line="240" w:lineRule="auto"/>
-              <w:ind w:firstLine="0"/>
-              <w:jc w:val="left"/>
-              <w:rPr/>
-            </w:pPr>
-            <w:r>
-              <w:rPr>
-                <w:sz w:val="22"/>
-                <w:szCs w:val="22"/>
-                <w:rtl w:val="0"/>
-              </w:rPr>
-              <w:t xml:space="preserve">OR = 6,56; Level 1 + OT nghỉ 52,6%; kịch bản mô phỏng: khoảng 61 ca ở nhóm mục tiêu</w:t>
+              <w:t xml:space="preserve">Level 1 làm thêm giờ (156 người) và NV mới vào 0-1 năm làm thêm giờ (69 người); hai nhóm chồng lấn 44 người, tổng cộng 181 người</w:t>
+            </w:r>
+          </w:p>
+        </w:tc>
+        <w:tc>
+          <w:tcPr>
+            <w:vAlign w:val="center"/>
+          </w:tcPr>
+          <w:p>
+            <w:pPr>
+              <w:spacing w:line="240" w:lineRule="auto"/>
+              <w:ind w:firstLine="0"/>
+              <w:jc w:val="left"/>
+              <w:rPr/>
+            </w:pPr>
+            <w:r>
+              <w:rPr>
+                <w:sz w:val="22"/>
+                <w:szCs w:val="22"/>
+                <w:rtl w:val="0"/>
+              </w:rPr>
+              <w:t xml:space="preserve">OR = 6,56; Level 1 + OT nghỉ 52,6%; kịch bản mô phỏng: khoảng 61 ca ở nhóm mục tiêu (đã tính phần chồng lấn)</w:t>
             </w:r>
           </w:p>
         </w:tc>
@@ -18006,7 +17960,7 @@
         <w:rPr>
           <w:rtl w:val="0"/>
         </w:rPr>
-        <w:t xml:space="preserve"> và cảnh báo 10% nhân viên đang làm có điểm cao nhất (khoảng 120 người); quản lý trực tiếp trao đổi 1:1 với người được cảnh báo trong 2 tuần và ghi lại nguyên nhân. Để tham khảo, ngưỡng xác suất 0,3 tương ứng khoảng 9% nhân viên đang làm (111 người) trên dữ liệu hiện tại; tỷ lệ cảnh báo nên được điều chỉnh theo số buổi trao đổi 1:1 mà quản lý tuyến xử lý được mỗi quý. Bước đầu tiên là làm việc ngay với 19 nhân viên đang làm thuộc nhóm rủi ro cao (4-5 cờ).</w:t>
+        <w:t xml:space="preserve"> và cảnh báo 10% nhân viên đang làm có điểm cao nhất (khoảng 120 người); quản lý trực tiếp trao đổi 1:1 với người được cảnh báo trong 2 tuần và ghi lại nguyên nhân. Để tham khảo, ngưỡng xác suất 0,3 tương ứng khoảng 9% nhân viên đang làm (111 người) trên dữ liệu hiện tại; tỷ lệ cảnh báo nên được điều chỉnh theo số buổi trao đổi 1:1 mà quản lý trực tiếp xử lý được mỗi quý. Bước đầu tiên là làm việc ngay với 19 nhân viên đang làm thuộc nhóm rủi ro cao (4-5 cờ). Vì mô hình và bộ cờ rủi ro có dùng tuổi, giới tính và tình trạng hôn nhân, danh sách cảnh báo chỉ nên dùng để chủ động trao đổi và hỗ trợ, không dùng cho các quyết định tuyển dụng, đánh giá, thăng chức hay chấm dứt hợp đồng; khi triển khai, HR nên dùng thêm một phiên bản điểm không có các đặc điểm này và rà soát tỷ lệ cảnh báo giữa các nhóm để tránh rủi ro phân biệt đối xử.</w:t>
       </w:r>
     </w:p>
     <w:p>
@@ -18032,7 +17986,7 @@
         <w:rPr>
           <w:rtl w:val="0"/>
         </w:rPr>
-        <w:t xml:space="preserve">Mục tiêu đề xuất là đưa tỷ lệ nghỉ (đo theo cùng cách của bộ dữ liệu) từ 16,1% xuống dưới 12%, tương đương khoảng 60 ca nghỉ ít hơn trên quy mô 1.470 nhân viên. Vì dữ liệu không có mốc thời gian, 16,1% không phải tỷ lệ nghỉ hằng năm; trước khi đặt mốc 12 tháng, HR cần đo tỷ lệ nghỉ theo năm làm mức cơ sở. Mục tiêu này thận trọng hơn kịch bản mô phỏng 10,5%, vì mô phỏng giả định làm thêm giờ là nguyên nhân trực tiếp. Giải pháp 3 (cổ phiếu) nên triển khai dưới dạng thí điểm có nhóm đối chứng để kiểm chứng hiệu quả trước khi mở rộng.</w:t>
+        <w:t xml:space="preserve">Mục tiêu đề xuất là đưa tỷ lệ nghỉ (đo theo cùng cách của bộ dữ liệu) từ 16,1% xuống dưới 12%, tương đương khoảng 60 ca nghỉ ít hơn trên quy mô 1.470 nhân viên. Vì dữ liệu không có mốc thời gian, 16,1% chưa thể coi là tỷ lệ nghỉ hằng năm; trước khi đặt mốc 12 tháng, HR cần đo tỷ lệ nghỉ theo năm làm mức cơ sở. Mục tiêu này thận trọng hơn kịch bản mô phỏng 10,5%, vì mô phỏng giả định làm thêm giờ là nguyên nhân trực tiếp. Giải pháp 3 (cổ phiếu) nên triển khai dưới dạng thí điểm có nhóm đối chứng để kiểm chứng hiệu quả trước khi mở rộng.</w:t>
       </w:r>
     </w:p>
     <w:p>
@@ -18074,7 +18028,7 @@
         <w:rPr>
           <w:rtl w:val="0"/>
         </w:rPr>
-        <w:t xml:space="preserve">Nghỉ việc tại công ty là vấn đề của tuyến đầu, không phải của cấp quản lý. Người nghỉ điển hình là nhân viên trẻ, mới vào, Level 1, không có cổ phiếu và phải làm thêm giờ. Trả lời bốn câu hỏi ban đầu:</w:t>
+        <w:t xml:space="preserve">Nghỉ việc tại công ty tập trung ở nhân viên cấp thấp, không phải ở cấp quản lý. Người nghỉ điển hình là nhân viên trẻ, mới vào, Level 1, không có cổ phiếu và phải làm thêm giờ. Trả lời bốn câu hỏi ban đầu:</w:t>
       </w:r>
     </w:p>
     <w:p>
@@ -18136,7 +18090,7 @@
         <w:rPr>
           <w:rtl w:val="0"/>
         </w:rPr>
-        <w:t xml:space="preserve"> Làm thêm giờ, không có cổ phiếu, công tác thường xuyên, mức hài lòng - gắn kết thấp, đổi quản lý và chậm thăng chức.</w:t>
+        <w:t xml:space="preserve"> Các yếu tố gắn với tỷ lệ nghỉ cao hơn: làm thêm giờ, không có cổ phiếu, công tác thường xuyên, mức hài lòng - gắn kết thấp, vừa đổi quản lý và chậm thăng chức.</w:t>
       </w:r>
     </w:p>
     <w:p>
@@ -18274,7 +18228,131 @@
         <w:rPr>
           <w:rtl w:val="0"/>
         </w:rPr>
-        <w:t xml:space="preserve"> điểm hiệu suất chỉ có 2 mức; 197 hồ sơ có số công ty từng làm mâu thuẫn; ba cột đơn giá không dùng được.</w:t>
+        <w:t xml:space="preserve"> điểm hiệu suất chỉ có 2 mức; 197 hồ sơ có số công ty từng làm không nhất quán (nhiều khả năng do cách mã hóa); ba cột đơn giá không dùng được.</w:t>
+      </w:r>
+    </w:p>
+    <w:p>
+      <w:pPr>
+        <w:tabs>
+          <w:tab w:val="left" w:leader="none" w:pos="1080"/>
+        </w:tabs>
+        <w:spacing w:after="120" w:line="240" w:lineRule="auto"/>
+        <w:ind w:left="1080" w:hanging="360"/>
+        <w:rPr/>
+      </w:pPr>
+      <w:r>
+        <w:rPr>
+          <w:rtl w:val="0"/>
+        </w:rPr>
+        <w:t xml:space="preserve">•</w:t>
+        <w:tab/>
+      </w:r>
+      <w:r>
+        <w:rPr>
+          <w:b w:val="1"/>
+          <w:bCs w:val="1"/>
+          <w:rtl w:val="0"/>
+        </w:rPr>
+        <w:t xml:space="preserve">Cổ phiếu và hôn nhân trùng nhau:</w:t>
+      </w:r>
+      <w:r>
+        <w:rPr>
+          <w:rtl w:val="0"/>
+        </w:rPr>
+        <w:t xml:space="preserve"> 100% nhân viên độc thân ở mức cổ phiếu 0, nên chưa kiểm chứng được tác động của quyền chọn cổ phiếu với nhóm độc thân; đề xuất cấp cổ phiếu cho nhóm này cần thí điểm có nhóm đối chứng.</w:t>
+      </w:r>
+    </w:p>
+    <w:p>
+      <w:pPr>
+        <w:tabs>
+          <w:tab w:val="left" w:leader="none" w:pos="1080"/>
+        </w:tabs>
+        <w:spacing w:after="120" w:line="240" w:lineRule="auto"/>
+        <w:ind w:left="1080" w:hanging="360"/>
+        <w:rPr/>
+      </w:pPr>
+      <w:r>
+        <w:rPr>
+          <w:rtl w:val="0"/>
+        </w:rPr>
+        <w:t xml:space="preserve">•</w:t>
+        <w:tab/>
+      </w:r>
+      <w:r>
+        <w:rPr>
+          <w:b w:val="1"/>
+          <w:bCs w:val="1"/>
+          <w:rtl w:val="0"/>
+        </w:rPr>
+        <w:t xml:space="preserve">Hiệu chỉnh xác suất chưa tốt:</w:t>
+      </w:r>
+      <w:r>
+        <w:rPr>
+          <w:rtl w:val="0"/>
+        </w:rPr>
+        <w:t xml:space="preserve"> kiểm định Hosmer-Lemeshow (χ²(8) = 75,7; p &lt; 0,001) cho thấy xác suất dự báo lệch so với tần suất thực tế, nên mô hình chỉ nên dùng để xếp hạng rủi ro.</w:t>
+      </w:r>
+    </w:p>
+    <w:p>
+      <w:pPr>
+        <w:tabs>
+          <w:tab w:val="left" w:leader="none" w:pos="1080"/>
+        </w:tabs>
+        <w:spacing w:after="120" w:line="240" w:lineRule="auto"/>
+        <w:ind w:left="1080" w:hanging="360"/>
+        <w:rPr/>
+      </w:pPr>
+      <w:r>
+        <w:rPr>
+          <w:rtl w:val="0"/>
+        </w:rPr>
+        <w:t xml:space="preserve">•</w:t>
+        <w:tab/>
+      </w:r>
+      <w:r>
+        <w:rPr>
+          <w:b w:val="1"/>
+          <w:bCs w:val="1"/>
+          <w:rtl w:val="0"/>
+        </w:rPr>
+        <w:t xml:space="preserve">Chi phí thay thế là giả định:</w:t>
+      </w:r>
+      <w:r>
+        <w:rPr>
+          <w:rtl w:val="0"/>
+        </w:rPr>
+        <w:t xml:space="preserve"> mức 20% và 50% lương năm dựa trên Boushey và Glynn (2012), không phải chi phí thực tế của công ty; các con số 2,7 triệu USD và khoản tiết kiệm mô phỏng chỉ để so sánh quy mô.</w:t>
+      </w:r>
+    </w:p>
+    <w:p>
+      <w:pPr>
+        <w:tabs>
+          <w:tab w:val="left" w:leader="none" w:pos="1080"/>
+        </w:tabs>
+        <w:spacing w:after="120" w:line="240" w:lineRule="auto"/>
+        <w:ind w:left="1080" w:hanging="360"/>
+        <w:rPr/>
+      </w:pPr>
+      <w:r>
+        <w:rPr>
+          <w:rtl w:val="0"/>
+        </w:rPr>
+        <w:t xml:space="preserve">•</w:t>
+        <w:tab/>
+      </w:r>
+      <w:r>
+        <w:rPr>
+          <w:b w:val="1"/>
+          <w:bCs w:val="1"/>
+          <w:rtl w:val="0"/>
+        </w:rPr>
+        <w:t xml:space="preserve">Chưa có kỳ thời gian:</w:t>
+      </w:r>
+      <w:r>
+        <w:rPr>
+          <w:rtl w:val="0"/>
+        </w:rPr>
+        <w:t xml:space="preserve"> 16,1% là tỷ lệ trong ảnh chụp dữ liệu, chưa thể coi là tỷ lệ nghỉ hằng năm.</w:t>
       </w:r>
     </w:p>
     <w:p>

</xml_diff>